<commit_message>
Tema 2 ve Tema 3 aciliislarindaki egilim/deger giris eklemeleri geri alindi (Tema 1 duzenine uygun)
</commit_message>
<xml_diff>
--- a/Kim11-2-1-Tersinir-Tepkimeler.docx
+++ b/Kim11-2-1-Tersinir-Tepkimeler.docx
@@ -492,22 +492,6 @@
           <w:lang w:val="tr-TR"/>
         </w:rPr>
         <w:t xml:space="preserve">• Zayıf asit/baz</w:t>
-      </w:r>
-    </w:p>
-    <w:p>
-      <w:pPr>
-        <w:jc w:val="both"/>
-        <w:rPr>
-          <w:rFonts w:ascii="Times New Roman" w:hAnsi="Times New Roman" w:cs="Times New Roman"/>
-          <w:lang w:val="tr-TR"/>
-        </w:rPr>
-      </w:pPr>
-      <w:r>
-        <w:rPr>
-          <w:rFonts w:ascii="Times New Roman" w:hAnsi="Times New Roman" w:cs="Times New Roman"/>
-          <w:lang w:val="tr-TR"/>
-        </w:rPr>
-        <w:t xml:space="preserve">Gazlı bir içeceğin kapağını açtığınızda yükselen kabarcıklar, mide ekşimesine karşı kullanılan bir ilaç ya da mağaraların tavanından sarkan kireç sütunları birbirinden çok farklı görünse de hepsinin arkasında dengeye ulaşan kimyasal süreçler vardır. Bu temada kimyasal dengeyi, asit ve baz çözeltilerindeki dengeyi ve suda az çözünen tuzların çözünürlük dengesini inceleyeceksiniz. Tema boyunca bilimsel gözlem yapma, bilimsel gözleme ve bilimsel veriye dayalı tahminde bulunma, operasyonel tanımlama, deney yapma, bilimsel çıkarım yapma, bilimsel model oluşturma, tümevarımsal akıl yürütme ve bilimsel sorgulama becerilerinizi kullanacaksınız. Asit-baz teorilerini karşılaştırırken ve sağlığınız için en uygun asidik ya da bazik ürüne karar verirken analitik düşünme, şüphe duyma ve eleştirel bakma eğilimlerinizi geliştirecek; grup çalışmalarında iletişim ve iş birliği becerilerinizle çalışkanlık, dostluk ve saygı değerlerini destekleyeceksiniz.</w:t>
       </w:r>
     </w:p>
     <w:p>

</xml_diff>

<commit_message>
Bolum kapagi gorsel kutularina Shutterstock ID'leri eklendi
</commit_message>
<xml_diff>
--- a/Kim11-2-1-Tersinir-Tepkimeler.docx
+++ b/Kim11-2-1-Tersinir-Tepkimeler.docx
@@ -840,23 +840,7 @@
                 <w:rFonts w:ascii="Times New Roman" w:hAnsi="Times New Roman" w:cs="Times New Roman"/>
                 <w:lang w:val="tr-TR"/>
               </w:rPr>
-              <w:t xml:space="preserve">Shutterstock arama: “stalactites stalagmites cave turkey”</w:t>
-            </w:r>
-          </w:p>
-          <w:p>
-            <w:pPr>
-              <w:jc w:val="both"/>
-              <w:rPr>
-                <w:rFonts w:ascii="Times New Roman" w:hAnsi="Times New Roman" w:cs="Times New Roman"/>
-                <w:lang w:val="tr-TR"/>
-              </w:rPr>
-            </w:pPr>
-            <w:r>
-              <w:rPr>
-                <w:rFonts w:ascii="Times New Roman" w:hAnsi="Times New Roman" w:cs="Times New Roman"/>
-                <w:lang w:val="tr-TR"/>
-              </w:rPr>
-              <w:t xml:space="preserve">Shutter ID: ……………</w:t>
+              <w:t xml:space="preserve">Shutter ID: 2482334227 (fotoğraf) — Stalactite and stalagmite formations in the Dim Cave, Alanya</w:t>
             </w:r>
           </w:p>
         </w:tc>

</xml_diff>

<commit_message>
Tema 2 kapak gorseli belirlendi (2659317859, buzlu maden suyu kabarciklari; eski evrensel indikator gorseli renk kuralina aykiriydi); Denge bolum kapagi Damlatas Magarasi'nin genis bir gorunumuyle degistirildi (2691997621)
</commit_message>
<xml_diff>
--- a/Kim11-2-1-Tersinir-Tepkimeler.docx
+++ b/Kim11-2-1-Tersinir-Tepkimeler.docx
@@ -115,7 +115,7 @@
                 <w:rFonts w:ascii="Times New Roman" w:hAnsi="Times New Roman" w:cs="Times New Roman"/>
                 <w:lang w:val="tr-TR"/>
               </w:rPr>
-              <w:t xml:space="preserve">GÖRSEL ALANI (Shutterstock)</w:t>
+              <w:t>GÖRSEL ALANI (Tema kapağı, tam sayfa; Shutterstock)</w:t>
             </w:r>
           </w:p>
           <w:p>
@@ -131,7 +131,7 @@
                 <w:rFonts w:ascii="Times New Roman" w:hAnsi="Times New Roman" w:cs="Times New Roman"/>
                 <w:lang w:val="tr-TR"/>
               </w:rPr>
-              <w:t xml:space="preserve">Tarif: Laboratuvarda farklı renklerde çözeltiler içeren erlen ve deney tüpleri; pH kâğıtları ya da evrensel indikatörle renklenmiş bir dizi çözelti (renk skalası).</w:t>
+              <w:t>Tarif: Maden suyu dolu bir bardakta buz küpleri ve yüzeye yükselen karbon dioksit kabarcıklarının yakın plan görüntüsü; mavi tonlar (tam sayfa tema kapağı). Görsel, gazın suda çözünme dengesini, karbonik asit oluşumunu ve buz-su fiziksel dengesini birlikte çağrıştırır.</w:t>
             </w:r>
           </w:p>
           <w:p>
@@ -147,7 +147,7 @@
                 <w:rFonts w:ascii="Times New Roman" w:hAnsi="Times New Roman" w:cs="Times New Roman"/>
                 <w:lang w:val="tr-TR"/>
               </w:rPr>
-              <w:t xml:space="preserve">Shutter ID: 721583056 (fotoğraf) — Standard pH solutions matched with universal indicator colors</w:t>
+              <w:t>Shutter ID: 2659317859 (fotoğraf) — Soda water with bubbles and ice cubes in a glass</w:t>
             </w:r>
           </w:p>
         </w:tc>
@@ -824,7 +824,7 @@
                 <w:rFonts w:ascii="Times New Roman" w:hAnsi="Times New Roman" w:cs="Times New Roman"/>
                 <w:lang w:val="tr-TR"/>
               </w:rPr>
-              <w:t xml:space="preserve">Tarif: Alanya Damlataş Mağarası ya da benzeri bir mağarada tavandan sarkan sarkıtlar ve yerden yükselen dikitler; loş, sıcak ışık (tam sayfa bölüm kapağı).</w:t>
+              <w:t>Tarif: Alanya Damlataş Mağarası’nın içinden geniş bir görünüm; tavandan sarkan yoğun sarkıtlar ve dikitler, sıcak sarı-turuncu ışık (tam sayfa bölüm kapağı).</w:t>
             </w:r>
           </w:p>
           <w:p>
@@ -840,7 +840,7 @@
                 <w:rFonts w:ascii="Times New Roman" w:hAnsi="Times New Roman" w:cs="Times New Roman"/>
                 <w:lang w:val="tr-TR"/>
               </w:rPr>
-              <w:t xml:space="preserve">Shutter ID: 2482334227 (fotoğraf) — Stalactite and stalagmite formations in the Dim Cave, Alanya</w:t>
+              <w:t>Shutter ID: 2691997621 (fotoğraf) — Damlataş Cave view, Alanya, Turkey</w:t>
             </w:r>
           </w:p>
         </w:tc>

</xml_diff>

<commit_message>
2.1: Tepkimelerin tek yonde ilerledigini mutlak olarak ifade eden cumle bilimsel olarak duzeltildi (urunlerin tepkenlere donusmesi gozlenebilecek olcude gerceklesmez)
</commit_message>
<xml_diff>
--- a/Kim11-2-1-Tersinir-Tepkimeler.docx
+++ b/Kim11-2-1-Tersinir-Tepkimeler.docx
@@ -2216,7 +2216,41 @@
           <w:rFonts w:ascii="Times New Roman" w:hAnsi="Times New Roman" w:cs="Times New Roman"/>
           <w:lang w:val="tr-TR"/>
         </w:rPr>
-        <w:t>Bir bardak demlenmiş çaya birkaç damla limon sıkıldığında çayın rengi açılır. Aynı çaya bir miktar karbonat (sodyum bikarbonat) eklendiğinde ise renk koyulaşır (Görsel A). Peki rengi açılan çaya karbonat, rengi koyulaşan çaya limon eklenirse ne olur? Çaydaki bazı renkli maddeler ortamın asitliğine göre farklı yapılar kazanır ve bu değişim ileri ve geri yönde tekrar tekrar gerçekleşebilir. Ders kitaplarında karşılaştığınız tepkimelerin çoğunda tepkenler ürünlere dönüşür ve tepkime tek yönde ilerler. Acaba bütün tepkimeler yalnızca tek yönde mi gerçekleşir? Ürünler tekrar tepkenlere dönüşebilir mi? Bu soruların cevabını bir etkinlik yaparak keşfediniz. Analiz ve Keşif Atölyesi 2.1.’de bilimsel gözlem yapacaksınız: Bir tepkimenin her iki yönde de ilerlediğini gösterebilecek renk, bulanıklık gibi nitelikleri belirleyecek, deneylerde ve görsellerde bu niteliklerdeki değişimleri veri olarak kaydedecek, sonra bu verilerle tepkimelerin tersinir olabileceğini açıklayacaksınız. Gözlemlerinizi merakla sorgulamanız ve kayıtlarınızı özenle tutmanız araştırmacı bir tutum kazanmanızı sağlarken çalışkanlık değerinizi de destekleyecektir.</w:t>
+        <w:t>Bir bardak demlenmiş çaya birkaç damla limon sıkıldığında çayın rengi açılır</w:t>
+      </w:r>
+      <w:r>
+        <w:rPr>
+          <w:rFonts w:ascii="Times New Roman" w:hAnsi="Times New Roman" w:cs="Times New Roman"/>
+          <w:lang w:val="tr-TR"/>
+        </w:rPr>
+        <w:t xml:space="preserve"> </w:t>
+      </w:r>
+      <w:r>
+        <w:rPr>
+          <w:rFonts w:ascii="Times New Roman" w:hAnsi="Times New Roman" w:cs="Times New Roman"/>
+          <w:lang w:val="tr-TR"/>
+        </w:rPr>
+        <w:t>(Görsel A)</w:t>
+      </w:r>
+      <w:r>
+        <w:rPr>
+          <w:rFonts w:ascii="Times New Roman" w:hAnsi="Times New Roman" w:cs="Times New Roman"/>
+          <w:lang w:val="tr-TR"/>
+        </w:rPr>
+        <w:t xml:space="preserve">. Aynı çaya bir miktar karbonat (sodyum bikarbonat) eklendiğinde ise renk koyulaşır. Peki rengi açılan çaya karbonat, rengi koyulaşan çaya limon eklenirse ne olur? Çaydaki bazı renkli maddeler ortamın asitliğine göre farklı yapılar kazanır ve bu değişim ileri ve geri yönde tekrar tekrar gerçekleşebilir. </w:t>
+      </w:r>
+      <w:r>
+        <w:rPr>
+          <w:rFonts w:ascii="Times New Roman" w:hAnsi="Times New Roman" w:cs="Times New Roman"/>
+          <w:lang w:val="tr-TR"/>
+        </w:rPr>
+      </w:r>
+      <w:r>
+        <w:rPr>
+          <w:rFonts w:ascii="Times New Roman" w:hAnsi="Times New Roman" w:cs="Times New Roman"/>
+          <w:lang w:val="tr-TR"/>
+        </w:rPr>
+        <w:t>Şimdiye kadar incelediğiniz tepkimelerin çoğunda tepkenlerin ürünlere dönüştüğünü ve tepkimenin tamamlandığını kabul ettiniz; bu tepkimelerde ürünlerin yeniden tepkenlere dönüşmesi gözlenebilecek ölçüde gerçekleşmez. Acaba bütün tepkimeler yalnızca tek yönde mi gerçekleşir? Ürünler tekrar tepkenlere dönüşebilir mi? Bu soruların cevabını bir etkinlik yaparak keşfediniz. Analiz ve Keşif Atölyesi 2.1.’de bilimsel gözlem yapacaksınız: Bir tepkimenin her iki yönde de ilerlediğini gösterebilecek renk, bulanıklık gibi nitelikleri belirleyecek, deneylerde ve görsellerde bu niteliklerdeki değişimleri veri olarak kaydedecek, sonra bu verilerle tepkimelerin tersinir olabileceğini açıklayacaksınız. Gözlemlerinizi merakla sorgulamanız ve kayıtlarınızı özenle tutmanız araştırmacı bir tutum kazanmanızı sağlarken çalışkanlık değerinizi de destekleyecektir.</w:t>
       </w:r>
     </w:p>
     <w:p>
@@ -2991,22 +3025,27 @@
         <w:jc w:val="center"/>
       </w:pPr>
       <w:r>
+        <w:rPr>
+          <w:noProof/>
+        </w:rPr>
+        <w:lastRenderedPageBreak/>
         <w:drawing>
-          <wp:inline xmlns:a="http://schemas.openxmlformats.org/drawingml/2006/main" xmlns:pic="http://schemas.openxmlformats.org/drawingml/2006/picture">
+          <wp:inline distT="0" distB="0" distL="0" distR="0" wp14:anchorId="29ECEFB1" wp14:editId="01B42522">
             <wp:extent cx="4680000" cy="4334781"/>
+            <wp:effectExtent l="0" t="0" r="0" b="0"/>
             <wp:docPr id="2066685187" name="Picture 2066685187"/>
             <wp:cNvGraphicFramePr>
-              <a:graphicFrameLocks noChangeAspect="1"/>
+              <a:graphicFrameLocks xmlns:a="http://schemas.openxmlformats.org/drawingml/2006/main" noChangeAspect="1"/>
             </wp:cNvGraphicFramePr>
-            <a:graphic>
+            <a:graphic xmlns:a="http://schemas.openxmlformats.org/drawingml/2006/main">
               <a:graphicData uri="http://schemas.openxmlformats.org/drawingml/2006/picture">
-                <pic:pic>
+                <pic:pic xmlns:pic="http://schemas.openxmlformats.org/drawingml/2006/picture">
                   <pic:nvPicPr>
                     <pic:cNvPr id="0" name="k11_21_NO2_N2O4_tupler.png"/>
                     <pic:cNvPicPr/>
                   </pic:nvPicPr>
                   <pic:blipFill>
-                    <a:blip r:embed="rId16"/>
+                    <a:blip r:embed="rId12"/>
                     <a:stretch>
                       <a:fillRect/>
                     </a:stretch>
@@ -3016,7 +3055,9 @@
                       <a:off x="0" y="0"/>
                       <a:ext cx="4680000" cy="4334781"/>
                     </a:xfrm>
-                    <a:prstGeom prst="rect"/>
+                    <a:prstGeom prst="rect">
+                      <a:avLst/>
+                    </a:prstGeom>
                   </pic:spPr>
                 </pic:pic>
               </a:graphicData>
@@ -3206,22 +3247,27 @@
         <w:jc w:val="center"/>
       </w:pPr>
       <w:r>
+        <w:rPr>
+          <w:noProof/>
+        </w:rPr>
+        <w:lastRenderedPageBreak/>
         <w:drawing>
-          <wp:inline xmlns:a="http://schemas.openxmlformats.org/drawingml/2006/main" xmlns:pic="http://schemas.openxmlformats.org/drawingml/2006/picture">
+          <wp:inline distT="0" distB="0" distL="0" distR="0" wp14:anchorId="770135EE" wp14:editId="047EEE97">
             <wp:extent cx="4680000" cy="3103972"/>
+            <wp:effectExtent l="0" t="0" r="0" b="0"/>
             <wp:docPr id="2066685188" name="Picture 2066685188"/>
             <wp:cNvGraphicFramePr>
-              <a:graphicFrameLocks noChangeAspect="1"/>
+              <a:graphicFrameLocks xmlns:a="http://schemas.openxmlformats.org/drawingml/2006/main" noChangeAspect="1"/>
             </wp:cNvGraphicFramePr>
-            <a:graphic>
+            <a:graphic xmlns:a="http://schemas.openxmlformats.org/drawingml/2006/main">
               <a:graphicData uri="http://schemas.openxmlformats.org/drawingml/2006/picture">
-                <pic:pic>
+                <pic:pic xmlns:pic="http://schemas.openxmlformats.org/drawingml/2006/picture">
                   <pic:nvPicPr>
                     <pic:cNvPr id="0" name="k11_21_kirec_suyu.png"/>
                     <pic:cNvPicPr/>
                   </pic:nvPicPr>
                   <pic:blipFill>
-                    <a:blip r:embed="rId17"/>
+                    <a:blip r:embed="rId13"/>
                     <a:stretch>
                       <a:fillRect/>
                     </a:stretch>
@@ -3231,7 +3277,9 @@
                       <a:off x="0" y="0"/>
                       <a:ext cx="4680000" cy="3103972"/>
                     </a:xfrm>
-                    <a:prstGeom prst="rect"/>
+                    <a:prstGeom prst="rect">
+                      <a:avLst/>
+                    </a:prstGeom>
                   </pic:spPr>
                 </pic:pic>
               </a:graphicData>
@@ -3660,6 +3708,7 @@
           <w:rFonts w:ascii="Times New Roman" w:hAnsi="Times New Roman" w:cs="Times New Roman"/>
           <w:lang w:val="tr-TR"/>
         </w:rPr>
+        <w:lastRenderedPageBreak/>
         <w:t>Etkinlikteki gözlemlerinizden hareketle tersinir bir tepkimenin oluşum sürecine ilişkin nitelikleri belirleyiniz.</w:t>
       </w:r>
     </w:p>
@@ -3710,7 +3759,6 @@
           <w:rFonts w:ascii="Times New Roman" w:hAnsi="Times New Roman" w:cs="Times New Roman"/>
           <w:lang w:val="tr-TR"/>
         </w:rPr>
-        <w:lastRenderedPageBreak/>
         <w:t>Gözlemlerinizden elde ettiğiniz kanıtlarla tersinir tepkimelere ilişkin bir yansıtma notu yazınız. Notunuzda bu etkinlikte neler öğrendiğinizi, sizi en çok neyin şaşırttığını ve hangi konuda daha fazla bilgi edinmek istediğinizi belirtiniz.</w:t>
       </w:r>
     </w:p>
@@ -4048,7 +4096,15 @@
           <w:rFonts w:ascii="Times New Roman" w:hAnsi="Times New Roman" w:cs="Times New Roman"/>
           <w:lang w:val="tr-TR"/>
         </w:rPr>
-        <w:t>Bir tepkimenin tersinir olduğu, ileri ve geri yöndeki değişimlere eşlik eden gözlemlenebilir niteliklerden anlaşılabilir. Renk değişimi, bir katının oluşması ya da çözünmesi, gaz çıkışı, sıcaklık ve pH değişimi gibi nitelikler tepkimenin hangi yönde ilerlediğinin kanıtıdır. Tepken ve ürünlerdeki gaz katsayıları toplamı farklı olan tepkimelerde sabit hacim ve sıcaklıkta basınç değişimi, iyon sayısının değiştiği tepkimelerde elektrik iletkenliği değişimi, katı bir maddenin oluştuğu ya da harcandığı tepkimelerde ise katı kütlesindeki değişim de tepkimenin her iki yönde ilerlediğini gösterebilir. Örneğin sarı renkli kromat iyonları içeren bir çözeltiye asit eklendiğinde turuncu renkli dikromat iyonları oluşur ve çözelti turuncuya döner; aynı çözeltiye baz eklendiğinde ise yeniden sarı renk gözlenir. Asit ve baz eklendikçe rengin tekrar tekrar değişebilmesi, aşağıdaki tepkimenin her iki yönde de gerçekleşebildiğini gösterir:</w:t>
+        <w:t xml:space="preserve">Bir tepkimenin tersinir olduğu, ileri ve geri yöndeki değişimlere eşlik eden gözlemlenebilir niteliklerden anlaşılabilir. Renk değişimi, bir katının oluşması ya da çözünmesi, gaz çıkışı, sıcaklık ve pH değişimi gibi nitelikler tepkimenin hangi yönde ilerlediğinin kanıtıdır. Tepken ve ürünlerdeki gaz katsayıları toplamı farklı olan tepkimelerde sabit hacim ve sıcaklıkta basınç değişimi, iyon sayısının değiştiği tepkimelerde elektrik iletkenliği değişimi, katı bir maddenin oluştuğu ya da harcandığı tepkimelerde ise katı kütlesindeki değişim de tepkimenin her iki yönde ilerlediğini gösterebilir. Örneğin sarı renkli kromat iyonları içeren bir çözeltiye asit eklendiğinde turuncu renkli dikromat iyonları oluşur ve çözelti turuncuya döner; aynı çözeltiye baz eklendiğinde </w:t>
+      </w:r>
+      <w:r>
+        <w:rPr>
+          <w:rFonts w:ascii="Times New Roman" w:hAnsi="Times New Roman" w:cs="Times New Roman"/>
+          <w:lang w:val="tr-TR"/>
+        </w:rPr>
+        <w:lastRenderedPageBreak/>
+        <w:t>ise yeniden sarı renk gözlenir. Asit ve baz eklendikçe rengin tekrar tekrar değişebilmesi, aşağıdaki tepkimenin her iki yönde de gerçekleşebildiğini gösterir:</w:t>
       </w:r>
     </w:p>
     <w:p>
@@ -4171,15 +4227,7 @@
           <w:rFonts w:ascii="Times New Roman" w:hAnsi="Times New Roman" w:cs="Times New Roman"/>
           <w:lang w:val="tr-TR"/>
         </w:rPr>
-        <w:t xml:space="preserve">Tersinir tepkimeler makro (gözlemlenebilir), alt mikro (tanecik) ve sembolik (denklem) düzeyde ifade edilebilir. Kobalt(II) klorür örneğinde makro düzeyde maviden pembeye ve pembeden </w:t>
-      </w:r>
-      <w:r>
-        <w:rPr>
-          <w:rFonts w:ascii="Times New Roman" w:hAnsi="Times New Roman" w:cs="Times New Roman"/>
-          <w:lang w:val="tr-TR"/>
-        </w:rPr>
-        <w:lastRenderedPageBreak/>
-        <w:t>maviye renk değişimi gözlenir. Alt mikro düzeyde su moleküllerinin kobalt(II) klorürün yapısına bağlandığı ya da bu yapıdan ayrıldığı düşünülür. Sembolik düzeyde ise bu değişim çift yönlü okla yazılan denklemle gösterilir. Peki ürünlerden biri ortamdan uzaklaşırsa geri tepkime gerçekleşebilir mi? Örneğin açık bir kapta ısıtılan kalsiyum karbonattan çıkan karbon dioksit ortamdan uzaklaştığı için tepkime yalnızca ileri yönde ilerler. Bu nedenle bir tersinir tepkimenin her iki yönde gözlenebilmesi için genellikle maddelerin ortamdan uzaklaşmasını engelleyen kapalı bir sistem gerekir.</w:t>
+        <w:t>Tersinir tepkimeler makro (gözlemlenebilir), alt mikro (tanecik) ve sembolik (denklem) düzeyde ifade edilebilir. Kobalt(II) klorür örneğinde makro düzeyde maviden pembeye ve pembeden maviye renk değişimi gözlenir. Alt mikro düzeyde su moleküllerinin kobalt(II) klorürün yapısına bağlandığı ya da bu yapıdan ayrıldığı düşünülür. Sembolik düzeyde ise bu değişim çift yönlü okla yazılan denklemle gösterilir. Peki ürünlerden biri ortamdan uzaklaşırsa geri tepkime gerçekleşebilir mi? Örneğin açık bir kapta ısıtılan kalsiyum karbonattan çıkan karbon dioksit ortamdan uzaklaştığı için tepkime yalnızca ileri yönde ilerler. Bu nedenle bir tersinir tepkimenin her iki yönde gözlenebilmesi için genellikle maddelerin ortamdan uzaklaşmasını engelleyen kapalı bir sistem gerekir.</w:t>
       </w:r>
     </w:p>
     <w:p>
@@ -4867,6 +4915,7 @@
                 <w:bCs/>
                 <w:lang w:val="tr-TR"/>
               </w:rPr>
+              <w:lastRenderedPageBreak/>
               <w:t>Olay</w:t>
             </w:r>
           </w:p>
@@ -5001,7 +5050,6 @@
                 <w:rFonts w:ascii="Times New Roman" w:hAnsi="Times New Roman" w:cs="Times New Roman"/>
                 <w:lang w:val="tr-TR"/>
               </w:rPr>
-              <w:lastRenderedPageBreak/>
               <w:t>Odunun yanması</w:t>
             </w:r>
           </w:p>
@@ -5666,6 +5714,7 @@
                 <w:rFonts w:ascii="Times New Roman" w:hAnsi="Times New Roman" w:cs="Times New Roman"/>
                 <w:lang w:val="tr-TR"/>
               </w:rPr>
+              <w:lastRenderedPageBreak/>
               <w:t>BaSO</w:t>
             </w:r>
             <w:r>
@@ -5933,7 +5982,6 @@
           <w:rFonts w:ascii="Times New Roman" w:hAnsi="Times New Roman" w:cs="Times New Roman"/>
           <w:lang w:val="tr-TR"/>
         </w:rPr>
-        <w:lastRenderedPageBreak/>
         <w:t>Tersinir tepkimelere ilişkin gözlemlenebilir nitelikleri gösteren videoya ulaşmak için karekodu okutunuz.</w:t>
       </w:r>
     </w:p>
@@ -6101,8 +6149,8 @@
       </w:r>
     </w:p>
     <w:sectPr>
-      <w:footerReference w:type="even" r:id="rId12"/>
-      <w:footerReference w:type="default" r:id="rId13"/>
+      <w:footerReference w:type="even" r:id="rId14"/>
+      <w:footerReference w:type="default" r:id="rId15"/>
       <w:pgSz w:w="12240" w:h="15840"/>
       <w:pgMar w:top="1440" w:right="1440" w:bottom="1440" w:left="1440" w:header="708" w:footer="708" w:gutter="0"/>
       <w:cols w:space="708"/>

</xml_diff>

<commit_message>
2.1 bilgi metnine alt mikro duzey gorselleri eklendi: Gorsel B (CoCl2 nem gostergesinin makro, alt mikro, sembolik gosterimi) ve Gorsel C (CaCO3'un acik ve kapali kapta isitilmasi, tanecik modelleriyle); metinde atiflar verildi
</commit_message>
<xml_diff>
--- a/Kim11-2-1-Tersinir-Tepkimeler.docx
+++ b/Kim11-2-1-Tersinir-Tepkimeler.docx
@@ -2223,34 +2223,14 @@
           <w:rFonts w:ascii="Times New Roman" w:hAnsi="Times New Roman" w:cs="Times New Roman"/>
           <w:lang w:val="tr-TR"/>
         </w:rPr>
-        <w:t xml:space="preserve"> </w:t>
-      </w:r>
-      <w:r>
-        <w:rPr>
-          <w:rFonts w:ascii="Times New Roman" w:hAnsi="Times New Roman" w:cs="Times New Roman"/>
-          <w:lang w:val="tr-TR"/>
-        </w:rPr>
-        <w:t>(Görsel A)</w:t>
-      </w:r>
-      <w:r>
-        <w:rPr>
-          <w:rFonts w:ascii="Times New Roman" w:hAnsi="Times New Roman" w:cs="Times New Roman"/>
-          <w:lang w:val="tr-TR"/>
-        </w:rPr>
-        <w:t xml:space="preserve">. Aynı çaya bir miktar karbonat (sodyum bikarbonat) eklendiğinde ise renk koyulaşır. Peki rengi açılan çaya karbonat, rengi koyulaşan çaya limon eklenirse ne olur? Çaydaki bazı renkli maddeler ortamın asitliğine göre farklı yapılar kazanır ve bu değişim ileri ve geri yönde tekrar tekrar gerçekleşebilir. </w:t>
-      </w:r>
-      <w:r>
-        <w:rPr>
-          <w:rFonts w:ascii="Times New Roman" w:hAnsi="Times New Roman" w:cs="Times New Roman"/>
-          <w:lang w:val="tr-TR"/>
-        </w:rPr>
-      </w:r>
-      <w:r>
-        <w:rPr>
-          <w:rFonts w:ascii="Times New Roman" w:hAnsi="Times New Roman" w:cs="Times New Roman"/>
-          <w:lang w:val="tr-TR"/>
-        </w:rPr>
-        <w:t>Şimdiye kadar incelediğiniz tepkimelerin çoğunda tepkenlerin ürünlere dönüştüğünü ve tepkimenin tamamlandığını kabul ettiniz; bu tepkimelerde ürünlerin yeniden tepkenlere dönüşmesi gözlenebilecek ölçüde gerçekleşmez. Acaba bütün tepkimeler yalnızca tek yönde mi gerçekleşir? Ürünler tekrar tepkenlere dönüşebilir mi? Bu soruların cevabını bir etkinlik yaparak keşfediniz. Analiz ve Keşif Atölyesi 2.1.’de bilimsel gözlem yapacaksınız: Bir tepkimenin her iki yönde de ilerlediğini gösterebilecek renk, bulanıklık gibi nitelikleri belirleyecek, deneylerde ve görsellerde bu niteliklerdeki değişimleri veri olarak kaydedecek, sonra bu verilerle tepkimelerin tersinir olabileceğini açıklayacaksınız. Gözlemlerinizi merakla sorgulamanız ve kayıtlarınızı özenle tutmanız araştırmacı bir tutum kazanmanızı sağlarken çalışkanlık değerinizi de destekleyecektir.</w:t>
+        <w:t xml:space="preserve"> (Görsel A)</w:t>
+      </w:r>
+      <w:r>
+        <w:rPr>
+          <w:rFonts w:ascii="Times New Roman" w:hAnsi="Times New Roman" w:cs="Times New Roman"/>
+          <w:lang w:val="tr-TR"/>
+        </w:rPr>
+        <w:t>. Aynı çaya bir miktar karbonat (sodyum bikarbonat) eklendiğinde ise renk koyulaşır. Peki rengi açılan çaya karbonat, rengi koyulaşan çaya limon eklenirse ne olur? Çaydaki bazı renkli maddeler ortamın asitliğine göre farklı yapılar kazanır ve bu değişim ileri ve geri yönde tekrar tekrar gerçekleşebilir. Şimdiye kadar incelediğiniz tepkimelerin çoğunda tepkenlerin ürünlere dönüştüğünü ve tepkimenin tamamlandığını kabul ettiniz. Acaba bütün tepkimeler yalnızca tek yönde mi gerçekleşir? Ürünler tekrar tepkenlere dönüşebilir mi? Bu soruların cevabını bir etkinlik yaparak keşfediniz. Analiz ve Keşif Atölyesi 2.1.’de bilimsel gözlem yapacaksınız: Bir tepkimenin her iki yönde de ilerlediğini gösterebilecek renk, bulanıklık gibi nitelikleri belirleyecek, deneylerde ve görsellerde bu niteliklerdeki değişimleri veri olarak kaydedecek, sonra bu verilerle tepkimelerin tersinir olabileceğini açıklayacaksınız. Gözlemlerinizi merakla sorgulamanız ve kayıtlarınızı özenle tutmanız araştırmacı bir tutum kazanmanızı sağlarken çalışkanlık değerinizi de destekleyecektir.</w:t>
       </w:r>
     </w:p>
     <w:p>
@@ -4227,7 +4207,121 @@
           <w:rFonts w:ascii="Times New Roman" w:hAnsi="Times New Roman" w:cs="Times New Roman"/>
           <w:lang w:val="tr-TR"/>
         </w:rPr>
-        <w:t>Tersinir tepkimeler makro (gözlemlenebilir), alt mikro (tanecik) ve sembolik (denklem) düzeyde ifade edilebilir. Kobalt(II) klorür örneğinde makro düzeyde maviden pembeye ve pembeden maviye renk değişimi gözlenir. Alt mikro düzeyde su moleküllerinin kobalt(II) klorürün yapısına bağlandığı ya da bu yapıdan ayrıldığı düşünülür. Sembolik düzeyde ise bu değişim çift yönlü okla yazılan denklemle gösterilir. Peki ürünlerden biri ortamdan uzaklaşırsa geri tepkime gerçekleşebilir mi? Örneğin açık bir kapta ısıtılan kalsiyum karbonattan çıkan karbon dioksit ortamdan uzaklaştığı için tepkime yalnızca ileri yönde ilerler. Bu nedenle bir tersinir tepkimenin her iki yönde gözlenebilmesi için genellikle maddelerin ortamdan uzaklaşmasını engelleyen kapalı bir sistem gerekir.</w:t>
+        <w:t>Tersinir tepkimeler makro (gözlemlenebilir), alt mikro (tanecik) ve sembolik (denklem) düzeyde ifade edilebilir. Kobalt(II) klorür örneğinde makro düzeyde maviden pembeye ve pembeden maviye renk değişimi gözlenir. Alt mikro düzeyde su moleküllerinin kobalt(II) klorürün yapısına bağlandığı ya da bu yapıdan ayrıldığı düşünülür. Sembolik düzeyde ise bu değişim çift yönlü okla yazılan denklemle gösterilir (Görsel B). Peki ürünlerden biri ortamdan uzaklaşırsa geri tepkime gerçekleşebilir mi? Örneğin açık bir kapta ısıtılan kalsiyum karbonattan çıkan karbon dioksit ortamdan uzaklaştığı için tepkime yalnızca ileri yönde ilerler. Bu nedenle bir tersinir tepkimenin her iki yönde gözlenebilmesi için genellikle maddelerin ortamdan uzaklaşmasını engelleyen kapalı bir sistem gerekir (Görsel C).</w:t>
+      </w:r>
+    </w:p>
+    <w:p>
+      <w:pPr>
+        <w:jc w:val="center"/>
+      </w:pPr>
+      <w:r>
+        <w:drawing>
+          <wp:inline xmlns:a="http://schemas.openxmlformats.org/drawingml/2006/main" xmlns:pic="http://schemas.openxmlformats.org/drawingml/2006/picture">
+            <wp:extent cx="4860000" cy="4353499"/>
+            <wp:docPr id="2066685189" name="Picture 2066685189"/>
+            <wp:cNvGraphicFramePr>
+              <a:graphicFrameLocks noChangeAspect="1"/>
+            </wp:cNvGraphicFramePr>
+            <a:graphic>
+              <a:graphicData uri="http://schemas.openxmlformats.org/drawingml/2006/picture">
+                <pic:pic>
+                  <pic:nvPicPr>
+                    <pic:cNvPr id="0" name="k11_21_CoCl2_uc_duzey.png"/>
+                    <pic:cNvPicPr/>
+                  </pic:nvPicPr>
+                  <pic:blipFill>
+                    <a:blip r:embed="rId18"/>
+                    <a:stretch>
+                      <a:fillRect/>
+                    </a:stretch>
+                  </pic:blipFill>
+                  <pic:spPr>
+                    <a:xfrm>
+                      <a:off x="0" y="0"/>
+                      <a:ext cx="4860000" cy="4353499"/>
+                    </a:xfrm>
+                    <a:prstGeom prst="rect"/>
+                  </pic:spPr>
+                </pic:pic>
+              </a:graphicData>
+            </a:graphic>
+          </wp:inline>
+        </w:drawing>
+      </w:r>
+    </w:p>
+    <w:p>
+      <w:pPr>
+        <w:jc w:val="center"/>
+        <w:rPr>
+          <w:rFonts w:ascii="Times New Roman" w:hAnsi="Times New Roman" w:cs="Times New Roman"/>
+          <w:lang w:val="tr-TR"/>
+        </w:rPr>
+      </w:pPr>
+      <w:r>
+        <w:rPr>
+          <w:rFonts w:ascii="Times New Roman" w:hAnsi="Times New Roman" w:cs="Times New Roman"/>
+          <w:b/>
+          <w:bCs/>
+          <w:lang w:val="tr-TR"/>
+        </w:rPr>
+        <w:t>Görsel B: Kobalt(II) klorürün suyla tersinir tepkimesinin makro, alt mikro ve sembolik düzeyde gösterimi</w:t>
+      </w:r>
+    </w:p>
+    <w:p>
+      <w:pPr>
+        <w:jc w:val="center"/>
+      </w:pPr>
+      <w:r>
+        <w:drawing>
+          <wp:inline xmlns:a="http://schemas.openxmlformats.org/drawingml/2006/main" xmlns:pic="http://schemas.openxmlformats.org/drawingml/2006/picture">
+            <wp:extent cx="4680000" cy="3649139"/>
+            <wp:docPr id="2066685190" name="Picture 2066685190"/>
+            <wp:cNvGraphicFramePr>
+              <a:graphicFrameLocks noChangeAspect="1"/>
+            </wp:cNvGraphicFramePr>
+            <a:graphic>
+              <a:graphicData uri="http://schemas.openxmlformats.org/drawingml/2006/picture">
+                <pic:pic>
+                  <pic:nvPicPr>
+                    <pic:cNvPr id="0" name="k11_21_CaCO3_acik_kapali.png"/>
+                    <pic:cNvPicPr/>
+                  </pic:nvPicPr>
+                  <pic:blipFill>
+                    <a:blip r:embed="rId19"/>
+                    <a:stretch>
+                      <a:fillRect/>
+                    </a:stretch>
+                  </pic:blipFill>
+                  <pic:spPr>
+                    <a:xfrm>
+                      <a:off x="0" y="0"/>
+                      <a:ext cx="4680000" cy="3649139"/>
+                    </a:xfrm>
+                    <a:prstGeom prst="rect"/>
+                  </pic:spPr>
+                </pic:pic>
+              </a:graphicData>
+            </a:graphic>
+          </wp:inline>
+        </w:drawing>
+      </w:r>
+    </w:p>
+    <w:p>
+      <w:pPr>
+        <w:jc w:val="center"/>
+        <w:rPr>
+          <w:rFonts w:ascii="Times New Roman" w:hAnsi="Times New Roman" w:cs="Times New Roman"/>
+          <w:lang w:val="tr-TR"/>
+        </w:rPr>
+      </w:pPr>
+      <w:r>
+        <w:rPr>
+          <w:rFonts w:ascii="Times New Roman" w:hAnsi="Times New Roman" w:cs="Times New Roman"/>
+          <w:b/>
+          <w:bCs/>
+          <w:lang w:val="tr-TR"/>
+        </w:rPr>
+        <w:t>Görsel C: Kalsiyum karbonatın açık ve kapalı kapta ısıtılması</w:t>
       </w:r>
     </w:p>
     <w:p>

</xml_diff>

<commit_message>
2.1 bilgi metni: katı ornekli Gorsel B (CoCl2) ve C (CaCO3) kaldirildi; uc duzey anlatimi N2 + 3H2 = 2NH3 gaz dengesiyle, acik-kapali sistem anlatimi N2O4-NO2 gaz karisimiyla yeniden yazildi; her paragrafin ardina kendi tanecik modelli gorseli kondu
</commit_message>
<xml_diff>
--- a/Kim11-2-1-Tersinir-Tepkimeler.docx
+++ b/Kim11-2-1-Tersinir-Tepkimeler.docx
@@ -4207,7 +4207,7 @@
           <w:rFonts w:ascii="Times New Roman" w:hAnsi="Times New Roman" w:cs="Times New Roman"/>
           <w:lang w:val="tr-TR"/>
         </w:rPr>
-        <w:t>Tersinir tepkimeler makro (gözlemlenebilir), alt mikro (tanecik) ve sembolik (denklem) düzeyde ifade edilebilir. Kobalt(II) klorür örneğinde makro düzeyde maviden pembeye ve pembeden maviye renk değişimi gözlenir. Alt mikro düzeyde su moleküllerinin kobalt(II) klorürün yapısına bağlandığı ya da bu yapıdan ayrıldığı düşünülür. Sembolik düzeyde ise bu değişim çift yönlü okla yazılan denklemle gösterilir (Görsel B). Peki ürünlerden biri ortamdan uzaklaşırsa geri tepkime gerçekleşebilir mi? Örneğin açık bir kapta ısıtılan kalsiyum karbonattan çıkan karbon dioksit ortamdan uzaklaştığı için tepkime yalnızca ileri yönde ilerler. Bu nedenle bir tersinir tepkimenin her iki yönde gözlenebilmesi için genellikle maddelerin ortamdan uzaklaşmasını engelleyen kapalı bir sistem gerekir (Görsel C).</w:t>
+        <w:t xml:space="preserve">Tersinir tepkimeler makro (gözlemlenebilir), alt mikro (tanecik) ve sembolik (denklem) düzeyde ifade edilebilir. Örneğin uygun sıcaklıkta kapalı bir kapta bulunan azot ve hidrojen gazları amonyak gazını oluşturur. Bu tepkimede gaz molekülü sayısı azaldığından sabit hacim ve sıcaklıkta kaptaki basınç düşer; amonyak ayrışarak yeniden azot ve hidrojen oluşturduğunda ise basınç artar. Bu basınç değişimi makro düzeyde gözlenir. Alt mikro düzeyde bir azot molekülü ile üç hidrojen molekülünün iki amonyak molekülüne dönüştüğü, amonyak moleküllerinin de ayrışarak yeniden azot ve hidrojen moleküllerini oluşturduğu düşünülür. Sembolik düzeyde ise bu değişim çift yönlü okla yazılan denklemle gösterilir (Görsel B).</w:t>
       </w:r>
     </w:p>
     <w:p>
@@ -4217,7 +4217,7 @@
       <w:r>
         <w:drawing>
           <wp:inline xmlns:a="http://schemas.openxmlformats.org/drawingml/2006/main" xmlns:pic="http://schemas.openxmlformats.org/drawingml/2006/picture">
-            <wp:extent cx="4860000" cy="4353499"/>
+            <wp:extent cx="4860000" cy="4464305"/>
             <wp:docPr id="2066685189" name="Picture 2066685189"/>
             <wp:cNvGraphicFramePr>
               <a:graphicFrameLocks noChangeAspect="1"/>
@@ -4226,11 +4226,11 @@
               <a:graphicData uri="http://schemas.openxmlformats.org/drawingml/2006/picture">
                 <pic:pic>
                   <pic:nvPicPr>
-                    <pic:cNvPr id="0" name="k11_21_CoCl2_uc_duzey.png"/>
+                    <pic:cNvPr id="0" name="k11_21_NH3_uc_duzey.png"/>
                     <pic:cNvPicPr/>
                   </pic:nvPicPr>
                   <pic:blipFill>
-                    <a:blip r:embed="rId18"/>
+                    <a:blip r:embed="rId20"/>
                     <a:stretch>
                       <a:fillRect/>
                     </a:stretch>
@@ -4238,7 +4238,7 @@
                   <pic:spPr>
                     <a:xfrm>
                       <a:off x="0" y="0"/>
-                      <a:ext cx="4860000" cy="4353499"/>
+                      <a:ext cx="4860000" cy="4464305"/>
                     </a:xfrm>
                     <a:prstGeom prst="rect"/>
                   </pic:spPr>
@@ -4264,7 +4264,203 @@
           <w:bCs/>
           <w:lang w:val="tr-TR"/>
         </w:rPr>
-        <w:t>Görsel B: Kobalt(II) klorürün suyla tersinir tepkimesinin makro, alt mikro ve sembolik düzeyde gösterimi</w:t>
+        <w:t>Görsel B: Azot ve hidrojenden amonyak oluşumunun makro, alt mikro ve sembolik düzeyde gösterimi</w:t>
+      </w:r>
+    </w:p>
+    <w:p>
+      <w:pPr>
+        <w:jc w:val="both"/>
+        <w:rPr>
+          <w:rFonts w:ascii="Times New Roman" w:hAnsi="Times New Roman" w:cs="Times New Roman"/>
+          <w:lang w:val="tr-TR"/>
+        </w:rPr>
+      </w:pPr>
+      <w:r>
+        <w:rPr>
+          <w:rFonts w:ascii="Times New Roman" w:hAnsi="Times New Roman" w:cs="Times New Roman"/>
+          <w:lang w:val="tr-TR"/>
+        </w:rPr>
+        <w:t xml:space="preserve">Peki tepkimede yer alan maddeler ortamdan uzaklaşırsa geri tepkime gözlenebilir mi? Örneğin ağzı açık bir kaptaki N</w:t>
+      </w:r>
+      <w:r>
+        <w:rPr>
+          <w:rFonts w:ascii="Times New Roman" w:hAnsi="Times New Roman" w:cs="Times New Roman"/>
+          <w:lang w:val="tr-TR"/>
+          <w:vertAlign w:val="subscript"/>
+        </w:rPr>
+        <w:t xml:space="preserve">2</w:t>
+      </w:r>
+      <w:r>
+        <w:rPr>
+          <w:rFonts w:ascii="Times New Roman" w:hAnsi="Times New Roman" w:cs="Times New Roman"/>
+          <w:lang w:val="tr-TR"/>
+        </w:rPr>
+        <w:t xml:space="preserve">O</w:t>
+      </w:r>
+      <w:r>
+        <w:rPr>
+          <w:rFonts w:ascii="Times New Roman" w:hAnsi="Times New Roman" w:cs="Times New Roman"/>
+          <w:lang w:val="tr-TR"/>
+          <w:vertAlign w:val="subscript"/>
+        </w:rPr>
+        <w:t xml:space="preserve">4</w:t>
+      </w:r>
+      <w:r>
+        <w:rPr>
+          <w:rFonts w:ascii="Times New Roman" w:hAnsi="Times New Roman" w:cs="Times New Roman"/>
+          <w:lang w:val="tr-TR"/>
+        </w:rPr>
+        <w:t xml:space="preserve"> ve NO</w:t>
+      </w:r>
+      <w:r>
+        <w:rPr>
+          <w:rFonts w:ascii="Times New Roman" w:hAnsi="Times New Roman" w:cs="Times New Roman"/>
+          <w:lang w:val="tr-TR"/>
+          <w:vertAlign w:val="subscript"/>
+        </w:rPr>
+        <w:t xml:space="preserve">2</w:t>
+      </w:r>
+      <w:r>
+        <w:rPr>
+          <w:rFonts w:ascii="Times New Roman" w:hAnsi="Times New Roman" w:cs="Times New Roman"/>
+          <w:lang w:val="tr-TR"/>
+        </w:rPr>
+        <w:t xml:space="preserve"> gazları kaptan çıkarak havaya karışır. Kaptan uzaklaşan NO</w:t>
+      </w:r>
+      <w:r>
+        <w:rPr>
+          <w:rFonts w:ascii="Times New Roman" w:hAnsi="Times New Roman" w:cs="Times New Roman"/>
+          <w:lang w:val="tr-TR"/>
+          <w:vertAlign w:val="subscript"/>
+        </w:rPr>
+        <w:t xml:space="preserve">2</w:t>
+      </w:r>
+      <w:r>
+        <w:rPr>
+          <w:rFonts w:ascii="Times New Roman" w:hAnsi="Times New Roman" w:cs="Times New Roman"/>
+          <w:lang w:val="tr-TR"/>
+        </w:rPr>
+        <w:t xml:space="preserve"> molekülleri yeniden birleşerek N</w:t>
+      </w:r>
+      <w:r>
+        <w:rPr>
+          <w:rFonts w:ascii="Times New Roman" w:hAnsi="Times New Roman" w:cs="Times New Roman"/>
+          <w:lang w:val="tr-TR"/>
+          <w:vertAlign w:val="subscript"/>
+        </w:rPr>
+        <w:t xml:space="preserve">2</w:t>
+      </w:r>
+      <w:r>
+        <w:rPr>
+          <w:rFonts w:ascii="Times New Roman" w:hAnsi="Times New Roman" w:cs="Times New Roman"/>
+          <w:lang w:val="tr-TR"/>
+        </w:rPr>
+        <w:t xml:space="preserve">O</w:t>
+      </w:r>
+      <w:r>
+        <w:rPr>
+          <w:rFonts w:ascii="Times New Roman" w:hAnsi="Times New Roman" w:cs="Times New Roman"/>
+          <w:lang w:val="tr-TR"/>
+          <w:vertAlign w:val="subscript"/>
+        </w:rPr>
+        <w:t xml:space="preserve">4</w:t>
+      </w:r>
+      <w:r>
+        <w:rPr>
+          <w:rFonts w:ascii="Times New Roman" w:hAnsi="Times New Roman" w:cs="Times New Roman"/>
+          <w:lang w:val="tr-TR"/>
+        </w:rPr>
+        <w:t xml:space="preserve"> oluşturamaz ve kapta denge kurulamaz. Ağzı kapalı bir kapta ise gaz molekülleri kapta kalır; N</w:t>
+      </w:r>
+      <w:r>
+        <w:rPr>
+          <w:rFonts w:ascii="Times New Roman" w:hAnsi="Times New Roman" w:cs="Times New Roman"/>
+          <w:lang w:val="tr-TR"/>
+          <w:vertAlign w:val="subscript"/>
+        </w:rPr>
+        <w:t xml:space="preserve">2</w:t>
+      </w:r>
+      <w:r>
+        <w:rPr>
+          <w:rFonts w:ascii="Times New Roman" w:hAnsi="Times New Roman" w:cs="Times New Roman"/>
+          <w:lang w:val="tr-TR"/>
+        </w:rPr>
+        <w:t xml:space="preserve">O</w:t>
+      </w:r>
+      <w:r>
+        <w:rPr>
+          <w:rFonts w:ascii="Times New Roman" w:hAnsi="Times New Roman" w:cs="Times New Roman"/>
+          <w:lang w:val="tr-TR"/>
+          <w:vertAlign w:val="subscript"/>
+        </w:rPr>
+        <w:t xml:space="preserve">4</w:t>
+      </w:r>
+      <w:r>
+        <w:rPr>
+          <w:rFonts w:ascii="Times New Roman" w:hAnsi="Times New Roman" w:cs="Times New Roman"/>
+          <w:lang w:val="tr-TR"/>
+        </w:rPr>
+        <w:t xml:space="preserve"> moleküllerinin NO</w:t>
+      </w:r>
+      <w:r>
+        <w:rPr>
+          <w:rFonts w:ascii="Times New Roman" w:hAnsi="Times New Roman" w:cs="Times New Roman"/>
+          <w:lang w:val="tr-TR"/>
+          <w:vertAlign w:val="subscript"/>
+        </w:rPr>
+        <w:t xml:space="preserve">2</w:t>
+      </w:r>
+      <w:r>
+        <w:rPr>
+          <w:rFonts w:ascii="Times New Roman" w:hAnsi="Times New Roman" w:cs="Times New Roman"/>
+          <w:lang w:val="tr-TR"/>
+        </w:rPr>
+        <w:t xml:space="preserve"> moleküllerine ayrışması ile NO</w:t>
+      </w:r>
+      <w:r>
+        <w:rPr>
+          <w:rFonts w:ascii="Times New Roman" w:hAnsi="Times New Roman" w:cs="Times New Roman"/>
+          <w:lang w:val="tr-TR"/>
+          <w:vertAlign w:val="subscript"/>
+        </w:rPr>
+        <w:t xml:space="preserve">2</w:t>
+      </w:r>
+      <w:r>
+        <w:rPr>
+          <w:rFonts w:ascii="Times New Roman" w:hAnsi="Times New Roman" w:cs="Times New Roman"/>
+          <w:lang w:val="tr-TR"/>
+        </w:rPr>
+        <w:t xml:space="preserve"> moleküllerinin birleşerek yeniden N</w:t>
+      </w:r>
+      <w:r>
+        <w:rPr>
+          <w:rFonts w:ascii="Times New Roman" w:hAnsi="Times New Roman" w:cs="Times New Roman"/>
+          <w:lang w:val="tr-TR"/>
+          <w:vertAlign w:val="subscript"/>
+        </w:rPr>
+        <w:t xml:space="preserve">2</w:t>
+      </w:r>
+      <w:r>
+        <w:rPr>
+          <w:rFonts w:ascii="Times New Roman" w:hAnsi="Times New Roman" w:cs="Times New Roman"/>
+          <w:lang w:val="tr-TR"/>
+        </w:rPr>
+        <w:t xml:space="preserve">O</w:t>
+      </w:r>
+      <w:r>
+        <w:rPr>
+          <w:rFonts w:ascii="Times New Roman" w:hAnsi="Times New Roman" w:cs="Times New Roman"/>
+          <w:lang w:val="tr-TR"/>
+          <w:vertAlign w:val="subscript"/>
+        </w:rPr>
+        <w:t xml:space="preserve">4</w:t>
+      </w:r>
+      <w:r>
+        <w:rPr>
+          <w:rFonts w:ascii="Times New Roman" w:hAnsi="Times New Roman" w:cs="Times New Roman"/>
+          <w:lang w:val="tr-TR"/>
+        </w:rPr>
+        <w:t xml:space="preserve"> oluşturması aynı kapta birlikte gerçekleşir. Bu nedenle bir tersinir tepkimenin her iki yönde gözlenebilmesi için genellikle maddelerin ortamdan uzaklaşmasını engelleyen kapalı bir sistem gerekir (Görsel C).</w:t>
       </w:r>
     </w:p>
     <w:p>
@@ -4274,7 +4470,7 @@
       <w:r>
         <w:drawing>
           <wp:inline xmlns:a="http://schemas.openxmlformats.org/drawingml/2006/main" xmlns:pic="http://schemas.openxmlformats.org/drawingml/2006/picture">
-            <wp:extent cx="4680000" cy="3649139"/>
+            <wp:extent cx="4680000" cy="3444217"/>
             <wp:docPr id="2066685190" name="Picture 2066685190"/>
             <wp:cNvGraphicFramePr>
               <a:graphicFrameLocks noChangeAspect="1"/>
@@ -4283,11 +4479,11 @@
               <a:graphicData uri="http://schemas.openxmlformats.org/drawingml/2006/picture">
                 <pic:pic>
                   <pic:nvPicPr>
-                    <pic:cNvPr id="0" name="k11_21_CaCO3_acik_kapali.png"/>
+                    <pic:cNvPr id="0" name="k11_21_N2O4_acik_kapali.png"/>
                     <pic:cNvPicPr/>
                   </pic:nvPicPr>
                   <pic:blipFill>
-                    <a:blip r:embed="rId19"/>
+                    <a:blip r:embed="rId21"/>
                     <a:stretch>
                       <a:fillRect/>
                     </a:stretch>
@@ -4295,7 +4491,7 @@
                   <pic:spPr>
                     <a:xfrm>
                       <a:off x="0" y="0"/>
-                      <a:ext cx="4680000" cy="3649139"/>
+                      <a:ext cx="4680000" cy="3444217"/>
                     </a:xfrm>
                     <a:prstGeom prst="rect"/>
                   </pic:spPr>
@@ -4321,7 +4517,64 @@
           <w:bCs/>
           <w:lang w:val="tr-TR"/>
         </w:rPr>
-        <w:t>Görsel C: Kalsiyum karbonatın açık ve kapalı kapta ısıtılması</w:t>
+        <w:t xml:space="preserve">Görsel C: Ağzı açık ve ağzı kapalı kaptaki N</w:t>
+      </w:r>
+      <w:r>
+        <w:rPr>
+          <w:rFonts w:ascii="Times New Roman" w:hAnsi="Times New Roman" w:cs="Times New Roman"/>
+          <w:b/>
+          <w:bCs/>
+          <w:lang w:val="tr-TR"/>
+          <w:vertAlign w:val="subscript"/>
+        </w:rPr>
+        <w:t xml:space="preserve">2</w:t>
+      </w:r>
+      <w:r>
+        <w:rPr>
+          <w:rFonts w:ascii="Times New Roman" w:hAnsi="Times New Roman" w:cs="Times New Roman"/>
+          <w:b/>
+          <w:bCs/>
+          <w:lang w:val="tr-TR"/>
+        </w:rPr>
+        <w:t xml:space="preserve">O</w:t>
+      </w:r>
+      <w:r>
+        <w:rPr>
+          <w:rFonts w:ascii="Times New Roman" w:hAnsi="Times New Roman" w:cs="Times New Roman"/>
+          <w:b/>
+          <w:bCs/>
+          <w:lang w:val="tr-TR"/>
+          <w:vertAlign w:val="subscript"/>
+        </w:rPr>
+        <w:t xml:space="preserve">4</w:t>
+      </w:r>
+      <w:r>
+        <w:rPr>
+          <w:rFonts w:ascii="Times New Roman" w:hAnsi="Times New Roman" w:cs="Times New Roman"/>
+          <w:b/>
+          <w:bCs/>
+          <w:lang w:val="tr-TR"/>
+        </w:rPr>
+        <w:t xml:space="preserve">-NO</w:t>
+      </w:r>
+      <w:r>
+        <w:rPr>
+          <w:rFonts w:ascii="Times New Roman" w:hAnsi="Times New Roman" w:cs="Times New Roman"/>
+          <w:b/>
+          <w:bCs/>
+          <w:lang w:val="tr-TR"/>
+          <w:vertAlign w:val="subscript"/>
+        </w:rPr>
+        <w:t xml:space="preserve">2</w:t>
+      </w:r>
+      <w:r>
+        <w:rPr>
+          <w:rFonts w:ascii="Times New Roman" w:hAnsi="Times New Roman" w:cs="Times New Roman"/>
+          <w:b/>
+          <w:bCs/>
+          <w:lang w:val="tr-TR"/>
+        </w:rPr>
+        <w:t xml:space="preserve"> gaz karışımı</w:t>
       </w:r>
     </w:p>
     <w:p>

</xml_diff>